<commit_message>
Rewrite introduction with argument-driven storyline (en/fa)
Co-Authored-By: Claude Sonnet 5.5 <noreply@anthropic.com>
Claude-Session: https://claude.ai/code/session_01QKbj24VsGxk6d97XVHWeWi
</commit_message>
<xml_diff>
--- a/introduction_en.docx
+++ b/introduction_en.docx
@@ -42,7 +42,7 @@
           <w:b w:val="0"/>
           <w:i w:val="0"/>
         </w:rPr>
-        <w:t>Financial reporting depends on information systems, and information systems depend on security. When an entity's systems are compromised, the reliability of the data that feed its financial statements, the effectiveness of the controls that protect them, and the continuity of the operations behind them are all placed in question. Cyber risk has therefore moved from being a concern of the information technology (IT) department to being a matter of audit planning, internal control evaluation and assurance reporting.</w:t>
+        <w:t>An audit opinion is a statement about numbers; a cyber incident is an event in systems. The distance between the two is short, and it is shrinking. Every figure in a set of financial statements has passed through applications, interfaces and databases that an adversary can alter, encrypt or exfiltrate, and most of the internal controls an auditor might rely on are performed, supported or monitored by information technology (IT). Cyber risk therefore reaches the audit through three channels: the reliability of the information the auditor examines, the reliability of the controls the auditor may rely on, and the entity's continuing ability to operate, which bears on going-concern and disclosure judgments.</w:t>
       </w:r>
     </w:p>
     <w:p>
@@ -55,7 +55,7 @@
           <w:b w:val="0"/>
           <w:i w:val="0"/>
         </w:rPr>
-        <w:t>Standard setters have responded. ISA 315 (Revised 2019), effective for periods beginning on or after 15 December 2021, requires the auditor to understand the entity's IT environment and general IT controls and to identify the risks arising from IT when assessing the risks of material misstatement (IAASB, 2019). Internal auditing has moved in the same direction: the Global Internal Audit Standards took effect on 9 January 2025 (IIA, 2024), and the Cybersecurity Topical Requirement, issued on 5 February 2025, became effective on 5 February 2026 (IIA, 2025).</w:t>
+        <w:t>Standard setters have recognized these channels. ISA 315 (Revised 2019), effective for periods beginning on or after 15 December 2021, requires the auditor to understand the entity's IT environment, to identify the IT applications and general IT controls that matter for information processing, and to identify and assess the risks arising from IT as part of assessing the risks of material misstatement (IAASB, 2019). The revision separates the assessment of inherent risk from that of control risk, introduces inherent risk factors such as complexity, subjectivity and change, and treats risk as a spectrum; where the auditor does not plan to test the operating effectiveness of controls, the risk of material misstatement equals inherent risk. A decision not to rely on controls therefore does not remove the IT environment from the risk assessment. Internal auditing has moved in parallel: the Global Internal Audit Standards took effect on 9 January 2025 (IIA, 2024), and the Cybersecurity Topical Requirement, issued on 5 February 2025 and effective from 5 February 2026, applies to any engagement with a cybersecurity component (IIA, 2025).</w:t>
       </w:r>
     </w:p>
     <w:p>
@@ -68,7 +68,7 @@
           <w:b w:val="0"/>
           <w:i w:val="0"/>
         </w:rPr>
-        <w:t>The guidance available to auditors, however, is organized around two different vantage points. Frameworks such as the NIST Cybersecurity Framework 2.0, which added a Govern function (NIST, 2024), ISO/IEC 27005:2022, which is aligned with ISO/IEC 27001:2022 and ISO 31000:2018 (ISO/IEC, 2022), and the AICPA description criteria for a cybersecurity risk management program (AICPA, 2017) describe what an entity should do. Auditing standards describe what an auditor should understand, assess and report. To our knowledge, no source integrates the two into a single account of what the assessment of cyber risk in an audit comprises.</w:t>
+        <w:t>What the standards do not supply is the content of a cyber risk assessment. They tell the auditor what to understand; they do not say which threats, vulnerabilities, control capabilities and governance arrangements make up the assessment. That content is borrowed from frameworks written for a different purpose. NIST CSF 2.0 organizes cybersecurity outcomes into six functions and, in its latest version, elevates governance to a function of its own (NIST, 2024). ISO/IEC 27005:2022 realigns information security risk management with ISO/IEC 27001:2022 and ISO 31000:2018, replaces 'impact' with 'consequence', and introduces risk scenarios alongside the contrast between event-based and asset-based identification (ISO/IEC, 2022). The AICPA's description criteria allow an entity to communicate its cybersecurity risk management program, including its governance structure and risk assessment process, in a voluntary examination engagement (AICPA, 2017). Each of these serves an entity that wishes to manage, or to demonstrate that it manages, cyber risk.</w:t>
       </w:r>
     </w:p>
     <w:p>
@@ -81,7 +81,7 @@
           <w:b w:val="0"/>
           <w:i w:val="0"/>
         </w:rPr>
-        <w:t>Prior research mirrors this division. Early evidence showed internal auditors concentrating on traditional IT risks such as safeguarding assets, application processing and data integrity (Hermanson et al., 2000), and linked information systems risk to audit planning (Bedard et al., 2005). Later work derived assurance models from COBIT, ISO, AICPA and NIST (Kahyaoğlu &amp; Çalıyurt, 2018), examined the characteristics of internal audit functions associated with cybersecurity audit (Islam et al., 2018), and asked whether the relationship between the internal audit and information security functions matters for security outcomes (Steinbart et al., 2018). Slapničar et al. (2022) built an index of cybersecurity audit effectiveness covering planning, performing and reporting. The mean score was 58 on a 100-point scale, planning and performing were strongly related, and reporting to the board was less closely tied to them. The drivers of that effectiveness have since been examined through a neo-institutional lens (Vuko et al., 2024), and external auditors' response to cyber incidents has been studied through audit fees (Li et al., 2020).</w:t>
+        <w:t>Borrowing creates a translation problem that the literature has not named. The auditor's risk is a risk to the fair presentation of financial statements, located at the level of assertions, classes of transactions and the IT applications that process them. The entity's cyber risk is a risk to security objectives, located at the level of assets, scenarios and organizational capabilities. Between the two lie three translations: of objective (from confidentiality, integrity and availability to fair presentation), of unit (from asset or scenario to assertion) and of evidence (from the entity's description of its program to evidence the auditor obtains and evaluates). In our reading, the profession has no agreed account of these translations, so each auditor makes them privately, and assessments may differ across auditors, firms and settings for reasons that no standard explains.</w:t>
       </w:r>
     </w:p>
     <w:p>
@@ -94,7 +94,7 @@
           <w:b w:val="0"/>
           <w:i w:val="0"/>
         </w:rPr>
-        <w:t>A parallel literature on risk assessment methods points to the same difficulty from the other side. Information security risk assessment methods differ in how completely they cover risk identification, estimation and evaluation (Wangen et al., 2018). Decision-analytic and probabilistic approaches have been proposed (Ganin et al., 2020; Wang et al., 2020), static framework-based views have been criticized for missing organizational and threat dynamics (Armenia et al., 2021), and the scarcity of open data limits quantification: a systematic review of 5,219 studies identified only 79 datasets (Cremer et al., 2022). Methods are plentiful, but what an auditor should assess, and who should assess it, remains scattered.</w:t>
+        <w:t>The empirical literature can be read as three waves of questions that circle this problem without isolating it. The first asked what auditors do with IT risk. Hermanson et al. (2000), surveying more than one hundred internal audit directors, found attention concentrated on traditional IT risks (safeguarding of assets, application processing and data integrity) with system development and acquisition receiving less, and Bedard et al. (2005) examined how information systems risk enters audit planning. The second wave asked how assurance over cybersecurity should be organized and what explains how much of it is done. Kahyaoğlu and Çalıyurt (2018) derived an assurance process from four frameworks (COBIT, ISO, AICPA and NIST) and argued for a central role for internal audit; Islam et al. (2018) related the extent of cybersecurity audit to characteristics of the internal audit function, governance and the risk function; and Steinbart et al. (2018) started from the observation that empirical evidence on internal audit's contribution to information security was scant. The third wave asked how good the audit is and why. Slapničar et al. (2022) measured cybersecurity audit effectiveness through planning, performing and reporting, Vuko et al. (2024) examined its drivers through a neo-institutional lens, and Li et al. (2020) asked whether external auditors respond to cyber incidents through audit fees.</w:t>
       </w:r>
     </w:p>
     <w:p>
@@ -107,7 +107,7 @@
           <w:b w:val="0"/>
           <w:i w:val="0"/>
         </w:rPr>
-        <w:t>We identify three limitations. First, the components of cyber risk assessment are spread across frameworks, standards and studies that use different vocabularies and boundaries. Second, existing work usually adopts a single vantage point, that of the entity's security management or that of the auditor, so we know little about where the two agree on what matters. Third, evidence on how the components are weighed outside the settings in which most studies were conducted is thin.</w:t>
+        <w:t>The third wave contains the clue. Slapničar et al. (2022) report a mean index of 58 on a 100-point scale and a strong association between planning and performing, but a weaker association of both with reporting to the board; their index tracked the maturity of cyber risk management as expected, yet not the probability of a successful attack. This can be read as a statement about the construct rather than about effort: either what is measured does not capture what makes an assessment good, or the outcome that would validate it is too rare and too poorly observed to serve as a criterion. In either case the field cannot yet say which components an effective assessment must contain, and so cannot evaluate, teach or standardize it.</w:t>
       </w:r>
     </w:p>
     <w:p>
@@ -120,7 +120,7 @@
           <w:b w:val="0"/>
           <w:i w:val="0"/>
         </w:rPr>
-        <w:t>Context matters for each of these limitations. Institutional theory suggests that the adoption of standards responds to coercive, mimetic and normative pressures (DiMaggio &amp; Powell, 1983), and contingency theory suggests that the applicability of control practices depends on organizational circumstances (Donaldson, 2001). Iranian entities and auditors operate under regulatory, infrastructure and sanctions conditions that differ from those in which most of the evidence above was gathered, so it cannot be assumed that the importance and feasibility of each component transfer unchanged. To the best of our knowledge, no study has examined, from both the audited entity's and the auditor's perspective, which components make up the assessment of cyber risk in audits in Iran.</w:t>
+        <w:t>A parallel literature on risk assessment methods arrives at a complementary difficulty. Methods differ in how completely they cover risk identification, estimation and evaluation (Wangen et al., 2018); decision-analytic and probabilistic models have been proposed to integrate threat, vulnerability and consequence (Ganin et al., 2020; Wang et al., 2020); and framework-based views have been criticized for offering a static snapshot that misses organizational and threat dynamics (Armenia et al., 2021). Yet quantification is bounded by data: a systematic review of 5,219 studies identified only 79 datasets (Cremer et al., 2022). In most audit settings, then, the assessment of cyber risk is, and will remain, a structured professional judgment, and the quality of a judgment depends on what is being judged. The auditing literature studies how much assessment is done and by whom; the methods literature studies how risk can be modelled; neither specifies the set of components that a judgment-based assessment by an auditor should cover.</w:t>
       </w:r>
     </w:p>
     <w:p>
@@ -133,7 +133,33 @@
           <w:b w:val="0"/>
           <w:i w:val="0"/>
         </w:rPr>
-        <w:t>We therefore ask three questions. RQ1: Which components of cyber risk assessment in auditing appear in international frameworks, auditing standards and prior research? RQ2: Which of these components do Iranian experts consider important and feasible, and which additional local components do they identify? RQ3: How do the perspectives of audited entities and of auditors differ in the importance they attach to the components? We proceed in three steps. First, we synthesize the literature and map candidate components against the AICPA, NIST, ISO and auditing-standard sources above, which yields 30 components in seven dimensions. Second, we validate and localize them in a Delphi study with two expert panels, one drawn from audited entities and one from auditors. Third, we compare the panels component by component.</w:t>
+        <w:t>Two further features sharpen the problem. The first is that the question is inherently two-sided. The entity holds knowledge of its systems; the auditor holds the responsibility to form an opinion; and each faces different information, incentives and constraints. Where the two agree on what matters, reliance, communication and coordination become feasible; where they diverge, an assessment gap opens that no single-sided study can reveal. Prior studies have sampled one side or a mixture of roles: internal audit directors in Hermanson et al. (2000), auditors and chief audit executives in Slapničar et al. (2022), and internal audit functions in Islam et al. (2018). To our knowledge, none elicits both sides on a common set of components.</w:t>
+      </w:r>
+    </w:p>
+    <w:p>
+      <w:pPr>
+        <w:spacing w:after="160" w:line="360" w:lineRule="auto"/>
+        <w:jc w:val="both"/>
+      </w:pPr>
+      <w:r>
+        <w:rPr>
+          <w:b w:val="0"/>
+          <w:i w:val="0"/>
+        </w:rPr>
+        <w:t>The second feature is context. Institutional theory holds that the adoption of standards responds to coercive, mimetic and normative pressures (DiMaggio &amp; Powell, 1983), and contingency theory holds that the usefulness of control practices depends on organizational circumstances (Donaldson, 2001). Components validated in settings with mature IT audit professions, available specialists, established attestation instruments and routinely disclosed incidents carry hidden assumptions about enabling conditions. Where those conditions differ, a component may remain important yet become infeasible, or feasible only in altered form, which means that importance and feasibility must be assessed separately. Iranian entities and auditors operate under regulatory, infrastructure and sanctions conditions that differ from those in which most of the evidence above was gathered. To the best of our knowledge, no study has examined, from both sides, which components make up the assessment of cyber risk in audits in Iran.</w:t>
+      </w:r>
+    </w:p>
+    <w:p>
+      <w:pPr>
+        <w:spacing w:after="160" w:line="360" w:lineRule="auto"/>
+        <w:jc w:val="both"/>
+      </w:pPr>
+      <w:r>
+        <w:rPr>
+          <w:b w:val="0"/>
+          <w:i w:val="0"/>
+        </w:rPr>
+        <w:t>These observations converge on a single gap: the construct of cyber risk assessment in an audit is under-specified (there is no agreed set of components), one-sided (it has been examined from one vantage point at a time) and context-untested (it is assumed to transfer). We address the three limbs in sequence, guided by three questions. RQ1: Which components of cyber risk assessment in auditing appear in international frameworks, auditing standards and prior research? RQ2: Which of these components do Iranian experts consider important and feasible, and which local components do they add? RQ3: How do the perspectives of audited entities and auditors differ in the importance they attach to the components? Each design choice answers one limb. A systematic synthesis and mapping against AICPA, NIST, ISO and auditing-standard sources addresses under-specification and yields 30 candidate components in seven dimensions. Two expert panels, one from audited entities and one from auditors, rating the same components address one-sidedness. Separate ratings of importance and feasibility, together with open questions, address context. A Delphi design is chosen because the scarcity of data (Cremer et al., 2022) leaves informed consensus as the best available criterion for validating a construct whose components cannot yet be tested against outcomes.</w:t>
       </w:r>
     </w:p>
     <w:p>
@@ -147,7 +173,7 @@
           <w:i w:val="0"/>
           <w:color w:val="C00000"/>
         </w:rPr>
-        <w:t>[Insert one or two sentences summarizing the principal findings once the analysis is complete: the components that reached consensus, those added by the experts, and the largest gaps between the two panels.]</w:t>
+        <w:t>[Insert two or three sentences summarizing the principal findings once the analysis is complete: the components that reached consensus, those added by the experts, the components rated important but infeasible, and the largest gaps between the two panels.]</w:t>
       </w:r>
     </w:p>
     <w:p>
@@ -160,7 +186,7 @@
           <w:b w:val="0"/>
           <w:i w:val="0"/>
         </w:rPr>
-        <w:t>This study contributes in three ways. Theoretically, it integrates entity-centred frameworks and auditing standards into a three-layer account of cyber risk assessment (risk model, management cycle and assurance) and shows where the two vantage points converge and diverge. Methodologically, it offers a traceable mapping from standards and prior research to components and uses a two-panel Delphi design that makes the comparison of perspectives explicit rather than assumed. Practically, the validated components give auditors and audit firms a structured basis for planning cyber risk assessments, give entities a view of what auditors are likely to examine, and give regulators and professional bodies in Iran evidence for training, guidance and standard setting. The components also provide the measurement foundation for follow-up research that tests structural relations among them.</w:t>
+        <w:t>The study makes four contributions. First, it names and structures the translation problem: it organizes cyber risk assessment in an audit into a risk model, a management cycle and an assurance layer, and locates each component within them. Second, it provides the first two-sided evidence on what the entity and the auditor each consider part of the assessment, and shows where they converge and diverge. Third, it separates importance from feasibility in a setting where enabling conditions differ from those assumed by most prior work, which turns the findings into a guide for where standards, training and regulation should invest. Fourth, it delivers a validated component set that serves as the measurement foundation for scale development and for follow-up research testing structural relations among the components. For auditors and audit firms the components give a structured basis for planning cyber risk assessments; for entities, a view of what auditors are likely to examine; for regulators and professional bodies, evidence for training, guidance and standard setting.</w:t>
       </w:r>
     </w:p>
     <w:p>
@@ -173,7 +199,7 @@
           <w:b w:val="0"/>
           <w:i w:val="0"/>
         </w:rPr>
-        <w:t>The remainder of the paper is organized as follows. Section 2 develops the theoretical background and the candidate components. Section 3 describes the research design, the expert panels and the consensus criteria. Section 4 reports the results, including the comparison of the two panels. Section 5 discusses the findings, their implications and limitations, and directions for future research.</w:t>
+        <w:t>The stakes are practical as well as scholarly. Until the construct is specified, the effectiveness of cyber risk assessment cannot be measured, collaboration between auditors and specialists cannot be designed, and standards cannot be calibrated to the settings in which they are applied. This paper specifies the construct, tests it with the people who must live with it, and shows where the profession and the entities it audits disagree about what matters. The remainder of the paper is organized as follows. Section 2 develops the theoretical background and the candidate components. Section 3 describes the research design, the expert panels and the consensus criteria. Section 4 reports the results, including the comparison of the two panels. Section 5 discusses the findings, their implications and limitations, and directions for future research.</w:t>
       </w:r>
     </w:p>
     <w:p>
@@ -654,7 +680,7 @@
                 <w:b w:val="0"/>
                 <w:sz w:val="18"/>
               </w:rPr>
-              <w:t>Motivation (territory)</w:t>
+              <w:t>Hook and stakes</w:t>
             </w:r>
           </w:p>
         </w:tc>
@@ -672,7 +698,7 @@
                 <w:b w:val="0"/>
                 <w:sz w:val="18"/>
               </w:rPr>
-              <w:t>Why cyber risk matters to financial reporting and assurance</w:t>
+              <w:t>Cyber risk reaches the audit through three channels</w:t>
             </w:r>
           </w:p>
         </w:tc>
@@ -690,7 +716,7 @@
                 <w:b w:val="0"/>
                 <w:sz w:val="18"/>
               </w:rPr>
-              <w:t>—</w:t>
+              <w:t>Reasoning (no citation)</w:t>
             </w:r>
           </w:p>
         </w:tc>
@@ -728,7 +754,7 @@
                 <w:b w:val="0"/>
                 <w:sz w:val="18"/>
               </w:rPr>
-              <w:t>Regulatory setting</w:t>
+              <w:t>Standards</w:t>
             </w:r>
           </w:p>
         </w:tc>
@@ -746,7 +772,7 @@
                 <w:b w:val="0"/>
                 <w:sz w:val="18"/>
               </w:rPr>
-              <w:t>Shows the topic is current and mandated</w:t>
+              <w:t>Standards recognize the channels</w:t>
             </w:r>
           </w:p>
         </w:tc>
@@ -802,7 +828,7 @@
                 <w:b w:val="0"/>
                 <w:sz w:val="18"/>
               </w:rPr>
-              <w:t>Problem framing</w:t>
+              <w:t>Where content comes from</w:t>
             </w:r>
           </w:p>
         </w:tc>
@@ -820,7 +846,7 @@
                 <w:b w:val="0"/>
                 <w:sz w:val="18"/>
               </w:rPr>
-              <w:t>Two vantage points, no integration</w:t>
+              <w:t>Content is borrowed from entity-side frameworks written for another purpose</w:t>
             </w:r>
           </w:p>
         </w:tc>
@@ -876,7 +902,7 @@
                 <w:b w:val="0"/>
                 <w:sz w:val="18"/>
               </w:rPr>
-              <w:t>Prior audit research</w:t>
+              <w:t>Central idea</w:t>
             </w:r>
           </w:p>
         </w:tc>
@@ -894,7 +920,81 @@
                 <w:b w:val="0"/>
                 <w:sz w:val="18"/>
               </w:rPr>
-              <w:t>What is known, in order</w:t>
+              <w:t>Translation problem: objective, unit, evidence</w:t>
+            </w:r>
+          </w:p>
+        </w:tc>
+        <w:tc>
+          <w:tcPr>
+            <w:tcW w:type="dxa" w:w="3402"/>
+          </w:tcPr>
+          <w:p>
+            <w:pPr>
+              <w:jc w:val="left"/>
+            </w:pPr>
+            <w:r/>
+            <w:r>
+              <w:rPr>
+                <w:b w:val="0"/>
+                <w:sz w:val="18"/>
+              </w:rPr>
+              <w:t>Authors' analytical lens</w:t>
+            </w:r>
+          </w:p>
+        </w:tc>
+      </w:tr>
+      <w:tr>
+        <w:tc>
+          <w:tcPr>
+            <w:tcW w:type="dxa" w:w="567"/>
+          </w:tcPr>
+          <w:p>
+            <w:pPr>
+              <w:jc w:val="left"/>
+            </w:pPr>
+            <w:r/>
+            <w:r>
+              <w:rPr>
+                <w:b w:val="0"/>
+                <w:sz w:val="18"/>
+              </w:rPr>
+              <w:t>5</w:t>
+            </w:r>
+          </w:p>
+        </w:tc>
+        <w:tc>
+          <w:tcPr>
+            <w:tcW w:type="dxa" w:w="1984"/>
+          </w:tcPr>
+          <w:p>
+            <w:pPr>
+              <w:jc w:val="left"/>
+            </w:pPr>
+            <w:r/>
+            <w:r>
+              <w:rPr>
+                <w:b w:val="0"/>
+                <w:sz w:val="18"/>
+              </w:rPr>
+              <w:t>Study trajectory</w:t>
+            </w:r>
+          </w:p>
+        </w:tc>
+        <w:tc>
+          <w:tcPr>
+            <w:tcW w:type="dxa" w:w="3118"/>
+          </w:tcPr>
+          <w:p>
+            <w:pPr>
+              <w:jc w:val="left"/>
+            </w:pPr>
+            <w:r/>
+            <w:r>
+              <w:rPr>
+                <w:b w:val="0"/>
+                <w:sz w:val="18"/>
+              </w:rPr>
+              <w:t>Three waves of questions</w:t>
             </w:r>
           </w:p>
         </w:tc>
@@ -932,7 +1032,7 @@
                 <w:b w:val="0"/>
                 <w:sz w:val="18"/>
               </w:rPr>
-              <w:t>5</w:t>
+              <w:t>6</w:t>
             </w:r>
           </w:p>
         </w:tc>
@@ -950,7 +1050,7 @@
                 <w:b w:val="0"/>
                 <w:sz w:val="18"/>
               </w:rPr>
-              <w:t>Prior methods research</w:t>
+              <w:t>The clue</w:t>
             </w:r>
           </w:p>
         </w:tc>
@@ -968,7 +1068,81 @@
                 <w:b w:val="0"/>
                 <w:sz w:val="18"/>
               </w:rPr>
-              <w:t>Same difficulty from the methods side</w:t>
+              <w:t>Effectiveness index tracks maturity, not attack probability: a construct problem</w:t>
+            </w:r>
+          </w:p>
+        </w:tc>
+        <w:tc>
+          <w:tcPr>
+            <w:tcW w:type="dxa" w:w="3402"/>
+          </w:tcPr>
+          <w:p>
+            <w:pPr>
+              <w:jc w:val="left"/>
+            </w:pPr>
+            <w:r/>
+            <w:r>
+              <w:rPr>
+                <w:b w:val="0"/>
+                <w:sz w:val="18"/>
+              </w:rPr>
+              <w:t>Slapničar 2022</w:t>
+            </w:r>
+          </w:p>
+        </w:tc>
+      </w:tr>
+      <w:tr>
+        <w:tc>
+          <w:tcPr>
+            <w:tcW w:type="dxa" w:w="567"/>
+          </w:tcPr>
+          <w:p>
+            <w:pPr>
+              <w:jc w:val="left"/>
+            </w:pPr>
+            <w:r/>
+            <w:r>
+              <w:rPr>
+                <w:b w:val="0"/>
+                <w:sz w:val="18"/>
+              </w:rPr>
+              <w:t>7</w:t>
+            </w:r>
+          </w:p>
+        </w:tc>
+        <w:tc>
+          <w:tcPr>
+            <w:tcW w:type="dxa" w:w="1984"/>
+          </w:tcPr>
+          <w:p>
+            <w:pPr>
+              <w:jc w:val="left"/>
+            </w:pPr>
+            <w:r/>
+            <w:r>
+              <w:rPr>
+                <w:b w:val="0"/>
+                <w:sz w:val="18"/>
+              </w:rPr>
+              <w:t>Methods stream</w:t>
+            </w:r>
+          </w:p>
+        </w:tc>
+        <w:tc>
+          <w:tcPr>
+            <w:tcW w:type="dxa" w:w="3118"/>
+          </w:tcPr>
+          <w:p>
+            <w:pPr>
+              <w:jc w:val="left"/>
+            </w:pPr>
+            <w:r/>
+            <w:r>
+              <w:rPr>
+                <w:b w:val="0"/>
+                <w:sz w:val="18"/>
+              </w:rPr>
+              <w:t>Data limits make assessment a structured judgment; components unspecified</w:t>
             </w:r>
           </w:p>
         </w:tc>
@@ -1006,7 +1180,7 @@
                 <w:b w:val="0"/>
                 <w:sz w:val="18"/>
               </w:rPr>
-              <w:t>6</w:t>
+              <w:t>8</w:t>
             </w:r>
           </w:p>
         </w:tc>
@@ -1024,7 +1198,7 @@
                 <w:b w:val="0"/>
                 <w:sz w:val="18"/>
               </w:rPr>
-              <w:t>Niche (gaps)</w:t>
+              <w:t>Gap 2: two-sided</w:t>
             </w:r>
           </w:p>
         </w:tc>
@@ -1042,7 +1216,229 @@
                 <w:b w:val="0"/>
                 <w:sz w:val="18"/>
               </w:rPr>
-              <w:t>Three limitations</w:t>
+              <w:t>No study elicits both sides on common components</w:t>
+            </w:r>
+          </w:p>
+        </w:tc>
+        <w:tc>
+          <w:tcPr>
+            <w:tcW w:type="dxa" w:w="3402"/>
+          </w:tcPr>
+          <w:p>
+            <w:pPr>
+              <w:jc w:val="left"/>
+            </w:pPr>
+            <w:r/>
+            <w:r>
+              <w:rPr>
+                <w:b w:val="0"/>
+                <w:sz w:val="18"/>
+              </w:rPr>
+              <w:t>Hermanson 2000; Slapničar 2022; Islam 2018</w:t>
+            </w:r>
+          </w:p>
+        </w:tc>
+      </w:tr>
+      <w:tr>
+        <w:tc>
+          <w:tcPr>
+            <w:tcW w:type="dxa" w:w="567"/>
+          </w:tcPr>
+          <w:p>
+            <w:pPr>
+              <w:jc w:val="left"/>
+            </w:pPr>
+            <w:r/>
+            <w:r>
+              <w:rPr>
+                <w:b w:val="0"/>
+                <w:sz w:val="18"/>
+              </w:rPr>
+              <w:t>9</w:t>
+            </w:r>
+          </w:p>
+        </w:tc>
+        <w:tc>
+          <w:tcPr>
+            <w:tcW w:type="dxa" w:w="1984"/>
+          </w:tcPr>
+          <w:p>
+            <w:pPr>
+              <w:jc w:val="left"/>
+            </w:pPr>
+            <w:r/>
+            <w:r>
+              <w:rPr>
+                <w:b w:val="0"/>
+                <w:sz w:val="18"/>
+              </w:rPr>
+              <w:t>Gap 3: context</w:t>
+            </w:r>
+          </w:p>
+        </w:tc>
+        <w:tc>
+          <w:tcPr>
+            <w:tcW w:type="dxa" w:w="3118"/>
+          </w:tcPr>
+          <w:p>
+            <w:pPr>
+              <w:jc w:val="left"/>
+            </w:pPr>
+            <w:r/>
+            <w:r>
+              <w:rPr>
+                <w:b w:val="0"/>
+                <w:sz w:val="18"/>
+              </w:rPr>
+              <w:t>Importance and feasibility must be separated</w:t>
+            </w:r>
+          </w:p>
+        </w:tc>
+        <w:tc>
+          <w:tcPr>
+            <w:tcW w:type="dxa" w:w="3402"/>
+          </w:tcPr>
+          <w:p>
+            <w:pPr>
+              <w:jc w:val="left"/>
+            </w:pPr>
+            <w:r/>
+            <w:r>
+              <w:rPr>
+                <w:b w:val="0"/>
+                <w:sz w:val="18"/>
+              </w:rPr>
+              <w:t>DiMaggio &amp; Powell 1983; Donaldson 2001</w:t>
+            </w:r>
+          </w:p>
+        </w:tc>
+      </w:tr>
+      <w:tr>
+        <w:tc>
+          <w:tcPr>
+            <w:tcW w:type="dxa" w:w="567"/>
+          </w:tcPr>
+          <w:p>
+            <w:pPr>
+              <w:jc w:val="left"/>
+            </w:pPr>
+            <w:r/>
+            <w:r>
+              <w:rPr>
+                <w:b w:val="0"/>
+                <w:sz w:val="18"/>
+              </w:rPr>
+              <w:t>10</w:t>
+            </w:r>
+          </w:p>
+        </w:tc>
+        <w:tc>
+          <w:tcPr>
+            <w:tcW w:type="dxa" w:w="1984"/>
+          </w:tcPr>
+          <w:p>
+            <w:pPr>
+              <w:jc w:val="left"/>
+            </w:pPr>
+            <w:r/>
+            <w:r>
+              <w:rPr>
+                <w:b w:val="0"/>
+                <w:sz w:val="18"/>
+              </w:rPr>
+              <w:t>Gap statement and design</w:t>
+            </w:r>
+          </w:p>
+        </w:tc>
+        <w:tc>
+          <w:tcPr>
+            <w:tcW w:type="dxa" w:w="3118"/>
+          </w:tcPr>
+          <w:p>
+            <w:pPr>
+              <w:jc w:val="left"/>
+            </w:pPr>
+            <w:r/>
+            <w:r>
+              <w:rPr>
+                <w:b w:val="0"/>
+                <w:sz w:val="18"/>
+              </w:rPr>
+              <w:t>Under-specified, one-sided, context-untested; each design choice answers one limb</w:t>
+            </w:r>
+          </w:p>
+        </w:tc>
+        <w:tc>
+          <w:tcPr>
+            <w:tcW w:type="dxa" w:w="3402"/>
+          </w:tcPr>
+          <w:p>
+            <w:pPr>
+              <w:jc w:val="left"/>
+            </w:pPr>
+            <w:r/>
+            <w:r>
+              <w:rPr>
+                <w:b w:val="0"/>
+                <w:sz w:val="18"/>
+              </w:rPr>
+              <w:t>Cremer 2022 (why Delphi)</w:t>
+            </w:r>
+          </w:p>
+        </w:tc>
+      </w:tr>
+      <w:tr>
+        <w:tc>
+          <w:tcPr>
+            <w:tcW w:type="dxa" w:w="567"/>
+          </w:tcPr>
+          <w:p>
+            <w:pPr>
+              <w:jc w:val="left"/>
+            </w:pPr>
+            <w:r/>
+            <w:r>
+              <w:rPr>
+                <w:b w:val="0"/>
+                <w:sz w:val="18"/>
+              </w:rPr>
+              <w:t>11</w:t>
+            </w:r>
+          </w:p>
+        </w:tc>
+        <w:tc>
+          <w:tcPr>
+            <w:tcW w:type="dxa" w:w="1984"/>
+          </w:tcPr>
+          <w:p>
+            <w:pPr>
+              <w:jc w:val="left"/>
+            </w:pPr>
+            <w:r/>
+            <w:r>
+              <w:rPr>
+                <w:b w:val="0"/>
+                <w:sz w:val="18"/>
+              </w:rPr>
+              <w:t>Findings preview</w:t>
+            </w:r>
+          </w:p>
+        </w:tc>
+        <w:tc>
+          <w:tcPr>
+            <w:tcW w:type="dxa" w:w="3118"/>
+          </w:tcPr>
+          <w:p>
+            <w:pPr>
+              <w:jc w:val="left"/>
+            </w:pPr>
+            <w:r/>
+            <w:r>
+              <w:rPr>
+                <w:b w:val="0"/>
+                <w:sz w:val="18"/>
+              </w:rPr>
+              <w:t>Insert after analysis</w:t>
             </w:r>
           </w:p>
         </w:tc>
@@ -1080,7 +1476,7 @@
                 <w:b w:val="0"/>
                 <w:sz w:val="18"/>
               </w:rPr>
-              <w:t>7</w:t>
+              <w:t>12</w:t>
             </w:r>
           </w:p>
         </w:tc>
@@ -1098,7 +1494,7 @@
                 <w:b w:val="0"/>
                 <w:sz w:val="18"/>
               </w:rPr>
-              <w:t>Context</w:t>
+              <w:t>Contributions</w:t>
             </w:r>
           </w:p>
         </w:tc>
@@ -1116,81 +1512,7 @@
                 <w:b w:val="0"/>
                 <w:sz w:val="18"/>
               </w:rPr>
-              <w:t>Why Iran, why theory matters</w:t>
-            </w:r>
-          </w:p>
-        </w:tc>
-        <w:tc>
-          <w:tcPr>
-            <w:tcW w:type="dxa" w:w="3402"/>
-          </w:tcPr>
-          <w:p>
-            <w:pPr>
-              <w:jc w:val="left"/>
-            </w:pPr>
-            <w:r/>
-            <w:r>
-              <w:rPr>
-                <w:b w:val="0"/>
-                <w:sz w:val="18"/>
-              </w:rPr>
-              <w:t>DiMaggio &amp; Powell 1983; Donaldson 2001</w:t>
-            </w:r>
-          </w:p>
-        </w:tc>
-      </w:tr>
-      <w:tr>
-        <w:tc>
-          <w:tcPr>
-            <w:tcW w:type="dxa" w:w="567"/>
-          </w:tcPr>
-          <w:p>
-            <w:pPr>
-              <w:jc w:val="left"/>
-            </w:pPr>
-            <w:r/>
-            <w:r>
-              <w:rPr>
-                <w:b w:val="0"/>
-                <w:sz w:val="18"/>
-              </w:rPr>
-              <w:t>8</w:t>
-            </w:r>
-          </w:p>
-        </w:tc>
-        <w:tc>
-          <w:tcPr>
-            <w:tcW w:type="dxa" w:w="1984"/>
-          </w:tcPr>
-          <w:p>
-            <w:pPr>
-              <w:jc w:val="left"/>
-            </w:pPr>
-            <w:r/>
-            <w:r>
-              <w:rPr>
-                <w:b w:val="0"/>
-                <w:sz w:val="18"/>
-              </w:rPr>
-              <w:t>Occupying the niche</w:t>
-            </w:r>
-          </w:p>
-        </w:tc>
-        <w:tc>
-          <w:tcPr>
-            <w:tcW w:type="dxa" w:w="3118"/>
-          </w:tcPr>
-          <w:p>
-            <w:pPr>
-              <w:jc w:val="left"/>
-            </w:pPr>
-            <w:r/>
-            <w:r>
-              <w:rPr>
-                <w:b w:val="0"/>
-                <w:sz w:val="18"/>
-              </w:rPr>
-              <w:t>Research questions and three-step design</w:t>
+              <w:t>Four contributions plus practical audiences</w:t>
             </w:r>
           </w:p>
         </w:tc>
@@ -1228,7 +1550,7 @@
                 <w:b w:val="0"/>
                 <w:sz w:val="18"/>
               </w:rPr>
-              <w:t>9</w:t>
+              <w:t>13</w:t>
             </w:r>
           </w:p>
         </w:tc>
@@ -1246,7 +1568,7 @@
                 <w:b w:val="0"/>
                 <w:sz w:val="18"/>
               </w:rPr>
-              <w:t>Findings preview</w:t>
+              <w:t>Closing and roadmap</w:t>
             </w:r>
           </w:p>
         </w:tc>
@@ -1264,155 +1586,7 @@
                 <w:b w:val="0"/>
                 <w:sz w:val="18"/>
               </w:rPr>
-              <w:t>To be written after the analysis</w:t>
-            </w:r>
-          </w:p>
-        </w:tc>
-        <w:tc>
-          <w:tcPr>
-            <w:tcW w:type="dxa" w:w="3402"/>
-          </w:tcPr>
-          <w:p>
-            <w:pPr>
-              <w:jc w:val="left"/>
-            </w:pPr>
-            <w:r/>
-            <w:r>
-              <w:rPr>
-                <w:b w:val="0"/>
-                <w:sz w:val="18"/>
-              </w:rPr>
-              <w:t>—</w:t>
-            </w:r>
-          </w:p>
-        </w:tc>
-      </w:tr>
-      <w:tr>
-        <w:tc>
-          <w:tcPr>
-            <w:tcW w:type="dxa" w:w="567"/>
-          </w:tcPr>
-          <w:p>
-            <w:pPr>
-              <w:jc w:val="left"/>
-            </w:pPr>
-            <w:r/>
-            <w:r>
-              <w:rPr>
-                <w:b w:val="0"/>
-                <w:sz w:val="18"/>
-              </w:rPr>
-              <w:t>10</w:t>
-            </w:r>
-          </w:p>
-        </w:tc>
-        <w:tc>
-          <w:tcPr>
-            <w:tcW w:type="dxa" w:w="1984"/>
-          </w:tcPr>
-          <w:p>
-            <w:pPr>
-              <w:jc w:val="left"/>
-            </w:pPr>
-            <w:r/>
-            <w:r>
-              <w:rPr>
-                <w:b w:val="0"/>
-                <w:sz w:val="18"/>
-              </w:rPr>
-              <w:t>Contributions</w:t>
-            </w:r>
-          </w:p>
-        </w:tc>
-        <w:tc>
-          <w:tcPr>
-            <w:tcW w:type="dxa" w:w="3118"/>
-          </w:tcPr>
-          <w:p>
-            <w:pPr>
-              <w:jc w:val="left"/>
-            </w:pPr>
-            <w:r/>
-            <w:r>
-              <w:rPr>
-                <w:b w:val="0"/>
-                <w:sz w:val="18"/>
-              </w:rPr>
-              <w:t>Theory, method, practice</w:t>
-            </w:r>
-          </w:p>
-        </w:tc>
-        <w:tc>
-          <w:tcPr>
-            <w:tcW w:type="dxa" w:w="3402"/>
-          </w:tcPr>
-          <w:p>
-            <w:pPr>
-              <w:jc w:val="left"/>
-            </w:pPr>
-            <w:r/>
-            <w:r>
-              <w:rPr>
-                <w:b w:val="0"/>
-                <w:sz w:val="18"/>
-              </w:rPr>
-              <w:t>—</w:t>
-            </w:r>
-          </w:p>
-        </w:tc>
-      </w:tr>
-      <w:tr>
-        <w:tc>
-          <w:tcPr>
-            <w:tcW w:type="dxa" w:w="567"/>
-          </w:tcPr>
-          <w:p>
-            <w:pPr>
-              <w:jc w:val="left"/>
-            </w:pPr>
-            <w:r/>
-            <w:r>
-              <w:rPr>
-                <w:b w:val="0"/>
-                <w:sz w:val="18"/>
-              </w:rPr>
-              <w:t>11</w:t>
-            </w:r>
-          </w:p>
-        </w:tc>
-        <w:tc>
-          <w:tcPr>
-            <w:tcW w:type="dxa" w:w="1984"/>
-          </w:tcPr>
-          <w:p>
-            <w:pPr>
-              <w:jc w:val="left"/>
-            </w:pPr>
-            <w:r/>
-            <w:r>
-              <w:rPr>
-                <w:b w:val="0"/>
-                <w:sz w:val="18"/>
-              </w:rPr>
-              <w:t>Roadmap</w:t>
-            </w:r>
-          </w:p>
-        </w:tc>
-        <w:tc>
-          <w:tcPr>
-            <w:tcW w:type="dxa" w:w="3118"/>
-          </w:tcPr>
-          <w:p>
-            <w:pPr>
-              <w:jc w:val="left"/>
-            </w:pPr>
-            <w:r/>
-            <w:r>
-              <w:rPr>
-                <w:b w:val="0"/>
-                <w:sz w:val="18"/>
-              </w:rPr>
-              <w:t>Section outline</w:t>
+              <w:t>Stakes, then outline of sections</w:t>
             </w:r>
           </w:p>
         </w:tc>

</xml_diff>